<commit_message>
Manual superusuario: corregir alta de consultora
- Admin del cliente (Maria) con rol 'admin', no 'super_admin' (modelo SaaS clasico)
- Crear usuario: 'Add user'/'Create new user' + Auto Confirm; UUID no necesario
- CAPTCHA como paso obligatorio del alta con regla de las 3 piezas (Cloudflare + Vercel + Supabase) y widget reutilizable
- Corregir matriz de roles: admin SI tiene acceso a Configuracion

Co-Authored-By: Claude Opus 4.8 <noreply@anthropic.com>
</commit_message>
<xml_diff>
--- a/MANUAL-SUPERUSUARIO.docx
+++ b/MANUAL-SUPERUSUARIO.docx
@@ -603,7 +603,7 @@
                 <w:sz w:val="20"/>
                 <w:szCs w:val="20"/>
               </w:rPr>
-              <w:t xml:space="preserve">Casi todo: empresas, búsquedas, selectores, postulantes, talentos, kanban, comisiones, garantías, KPIs. NO: usuarios ni configuración</w:t>
+              <w:t xml:space="preserve">Casi todo: empresas, búsquedas, selectores, postulantes, talentos, kanban, comisiones, garantías, KPIs y Configuración. NO: gestión de usuarios/roles ni Consola</w:t>
             </w:r>
           </w:p>
         </w:tc>
@@ -2864,7 +2864,7 @@
           <w:b/>
           <w:bCs/>
         </w:rPr>
-        <w:t xml:space="preserve">Crea el usuario admin de ConfiaRH:</w:t>
+        <w:t xml:space="preserve">Crea el usuario admin de ConfiaRH (María es admin, NO super_admin):</w:t>
       </w:r>
     </w:p>
     <w:p>
@@ -2890,7 +2890,7 @@
         <w:spacing w:after="80"/>
       </w:pPr>
       <w:r>
-        <w:t xml:space="preserve">Tocá 'Invite' (verde, arriba)</w:t>
+        <w:t xml:space="preserve">Tocá 'Add user' → 'Create new user'</w:t>
       </w:r>
     </w:p>
     <w:p>
@@ -2916,20 +2916,33 @@
         <w:spacing w:after="80"/>
       </w:pPr>
       <w:r>
-        <w:t xml:space="preserve">Custom password: ConfiaRH2024!Temp (temporal)</w:t>
-      </w:r>
-    </w:p>
-    <w:p>
-      <w:pPr>
-        <w:pStyle w:val="ListParagraph"/>
-        <w:numPr>
-          <w:ilvl w:val="0"/>
-          <w:numId w:val="2"/>
-        </w:numPr>
-        <w:spacing w:after="80"/>
-      </w:pPr>
-      <w:r>
-        <w:t xml:space="preserve">Tocá 'Invite'</w:t>
+        <w:t xml:space="preserve">Password: ConfiaRH2024!Temp (temporal, ella la cambia)</w:t>
+      </w:r>
+    </w:p>
+    <w:p>
+      <w:pPr>
+        <w:pStyle w:val="ListParagraph"/>
+        <w:numPr>
+          <w:ilvl w:val="0"/>
+          <w:numId w:val="2"/>
+        </w:numPr>
+        <w:spacing w:after="80"/>
+      </w:pPr>
+      <w:r>
+        <w:t xml:space="preserve">Tildá 'Auto Confirm User' (si no, no puede entrar hasta confirmar por email)</w:t>
+      </w:r>
+    </w:p>
+    <w:p>
+      <w:pPr>
+        <w:pStyle w:val="ListParagraph"/>
+        <w:numPr>
+          <w:ilvl w:val="0"/>
+          <w:numId w:val="2"/>
+        </w:numPr>
+        <w:spacing w:after="80"/>
+      </w:pPr>
+      <w:r>
+        <w:t xml:space="preserve">Tocá 'Create user'. El UUID no hace falta copiarlo.</w:t>
       </w:r>
     </w:p>
     <w:p>
@@ -2941,7 +2954,7 @@
           <w:b/>
           <w:bCs/>
         </w:rPr>
-        <w:t xml:space="preserve">Asigna rol super_admin a María:</w:t>
+        <w:t xml:space="preserve">Asigna el rol 'admin' a María (no super_admin — el super_admin sos vos):</w:t>
       </w:r>
     </w:p>
     <w:p>
@@ -2996,12 +3009,102 @@
                 <w:sz w:val="20"/>
                 <w:szCs w:val="20"/>
               </w:rPr>
-              <w:t xml:space="preserve">UPDATE public.profiles SET rol = 'super_admin' WHERE email = 'maria@confiarh.com.ar';</w:t>
+              <w:t xml:space="preserve">UPDATE public.profiles SET rol = 'admin' WHERE email = 'maria@confiarh.com.ar';</w:t>
             </w:r>
           </w:p>
         </w:tc>
       </w:tr>
     </w:tbl>
+    <w:p>
+      <w:pPr>
+        <w:pStyle w:val="ListParagraph"/>
+        <w:numPr>
+          <w:ilvl w:val="0"/>
+          <w:numId w:val="2"/>
+        </w:numPr>
+        <w:spacing w:after="80"/>
+      </w:pPr>
+      <w:r>
+        <w:t xml:space="preserve">Funciona desde el SQL Editor (permisos de servidor). Desde la app solo un super_admin cambia roles.</w:t>
+      </w:r>
+    </w:p>
+    <w:p>
+      <w:pPr>
+        <w:spacing w:after="120"/>
+      </w:pPr>
+      <w:r>
+        <w:rPr>
+          <w:b/>
+          <w:bCs/>
+        </w:rPr>
+        <w:t xml:space="preserve">Configura el CAPTCHA (paso OBLIGATORIO del alta):</w:t>
+      </w:r>
+    </w:p>
+    <w:p>
+      <w:pPr>
+        <w:pStyle w:val="ListParagraph"/>
+        <w:numPr>
+          <w:ilvl w:val="0"/>
+          <w:numId w:val="2"/>
+        </w:numPr>
+        <w:spacing w:after="80"/>
+      </w:pPr>
+      <w:r>
+        <w:t xml:space="preserve">Las 3 piezas tienen que estar puestas o nadie puede entrar:</w:t>
+      </w:r>
+    </w:p>
+    <w:p>
+      <w:pPr>
+        <w:pStyle w:val="ListParagraph"/>
+        <w:numPr>
+          <w:ilvl w:val="0"/>
+          <w:numId w:val="2"/>
+        </w:numPr>
+        <w:spacing w:after="80"/>
+      </w:pPr>
+      <w:r>
+        <w:t xml:space="preserve">1) Dominio de la consultora agregado al widget de Cloudflare Turnstile</w:t>
+      </w:r>
+    </w:p>
+    <w:p>
+      <w:pPr>
+        <w:pStyle w:val="ListParagraph"/>
+        <w:numPr>
+          <w:ilvl w:val="0"/>
+          <w:numId w:val="2"/>
+        </w:numPr>
+        <w:spacing w:after="80"/>
+      </w:pPr>
+      <w:r>
+        <w:t xml:space="preserve">2) Site Key en Vercel (NEXT_PUBLIC_TURNSTILE_SITE_KEY)</w:t>
+      </w:r>
+    </w:p>
+    <w:p>
+      <w:pPr>
+        <w:pStyle w:val="ListParagraph"/>
+        <w:numPr>
+          <w:ilvl w:val="0"/>
+          <w:numId w:val="2"/>
+        </w:numPr>
+        <w:spacing w:after="80"/>
+      </w:pPr>
+      <w:r>
+        <w:t xml:space="preserve">3) Secret Key + CAPTCHA ON en Supabase → Authentication → Attack Protection</w:t>
+      </w:r>
+    </w:p>
+    <w:p>
+      <w:pPr>
+        <w:pStyle w:val="ListParagraph"/>
+        <w:numPr>
+          <w:ilvl w:val="0"/>
+          <w:numId w:val="2"/>
+        </w:numPr>
+        <w:spacing w:after="80"/>
+      </w:pPr>
+      <w:r>
+        <w:t xml:space="preserve">Las claves de Cloudflare se reutilizan entre consultoras: un solo widget, agregás el dominio nuevo.</w:t>
+      </w:r>
+    </w:p>
     <w:r>
       <w:br w:type="page"/>
     </w:r>
@@ -4765,7 +4868,7 @@
         <w:spacing w:after="80"/>
       </w:pPr>
       <w:r>
-        <w:t xml:space="preserve">admin: acceso total al panel, sin usuarios ni config</w:t>
+        <w:t xml:space="preserve">admin: acceso total al panel incluida Configuración; NO gestiona usuarios/roles ni Consola</w:t>
       </w:r>
     </w:p>
     <w:p>

</xml_diff>

<commit_message>
Docs: flujo de alta automatizada (script + token) en runbook y manual superusuario
- ALTA-CONSULTORA.md: resumen rapido A/B/C arriba + nota del token
- MANUAL-SUPERUSUARIO.md (.md + .docx): seccion 'Alta automatizada (atajo con script)'
  con las 3 partes, que es el token de Vercel y la nota del callback unico de Google

Co-Authored-By: Claude Opus 4.8 <noreply@anthropic.com>
</commit_message>
<xml_diff>
--- a/MANUAL-SUPERUSUARIO.docx
+++ b/MANUAL-SUPERUSUARIO.docx
@@ -3107,6 +3107,289 @@
       </w:pPr>
       <w:r>
         <w:t xml:space="preserve">Las claves de Cloudflare se reutilizan entre consultoras: un solo widget, agregás el dominio nuevo.</w:t>
+      </w:r>
+    </w:p>
+    <w:p>
+      <w:r>
+        <w:br w:type="page"/>
+      </w:r>
+    </w:p>
+    <w:p>
+      <w:pPr>
+        <w:pStyle w:val="Heading1"/>
+        <w:spacing w:after="160" w:before="280"/>
+      </w:pPr>
+      <w:r>
+        <w:rPr>
+          <w:b/>
+          <w:bCs/>
+          <w:color w:val="4338CA"/>
+          <w:sz w:val="32"/>
+          <w:szCs w:val="32"/>
+        </w:rPr>
+        <w:t xml:space="preserve">Alta automatizada (atajo con script)</w:t>
+      </w:r>
+    </w:p>
+    <w:p>
+      <w:pPr>
+        <w:spacing w:after="120"/>
+      </w:pPr>
+      <w:r>
+        <w:t xml:space="preserve">La parte más tediosa del alta —crear el proyecto en Vercel y cargar las 9 variables de entorno— está automatizada en un script. El flujo queda en 3 partes:</w:t>
+      </w:r>
+    </w:p>
+    <w:p>
+      <w:pPr>
+        <w:pStyle w:val="Heading2"/>
+        <w:spacing w:after="120" w:before="200"/>
+      </w:pPr>
+      <w:r>
+        <w:rPr>
+          <w:b/>
+          <w:bCs/>
+          <w:sz w:val="28"/>
+          <w:szCs w:val="28"/>
+        </w:rPr>
+        <w:t xml:space="preserve">Parte A — Supabase (a mano, cuenta del cliente)</w:t>
+      </w:r>
+    </w:p>
+    <w:p>
+      <w:pPr>
+        <w:pStyle w:val="ListParagraph"/>
+        <w:numPr>
+          <w:ilvl w:val="0"/>
+          <w:numId w:val="2"/>
+        </w:numPr>
+        <w:spacing w:after="80"/>
+      </w:pPr>
+      <w:r>
+        <w:t xml:space="preserve">El cliente crea su cuenta + proyecto en Supabase</w:t>
+      </w:r>
+    </w:p>
+    <w:p>
+      <w:pPr>
+        <w:pStyle w:val="ListParagraph"/>
+        <w:numPr>
+          <w:ilvl w:val="0"/>
+          <w:numId w:val="2"/>
+        </w:numPr>
+        <w:spacing w:after="80"/>
+      </w:pPr>
+      <w:r>
+        <w:t xml:space="preserve">SQL Editor → correr webapp/supabase/MIGRACIONES-BUNDLE.sql (las 8 migraciones de una)</w:t>
+      </w:r>
+    </w:p>
+    <w:p>
+      <w:pPr>
+        <w:pStyle w:val="ListParagraph"/>
+        <w:numPr>
+          <w:ilvl w:val="0"/>
+          <w:numId w:val="2"/>
+        </w:numPr>
+        <w:spacing w:after="80"/>
+      </w:pPr>
+      <w:r>
+        <w:t xml:space="preserve">Crear el admin del cliente (Auto Confirm) + SQL: update public.profiles set rol = 'admin'</w:t>
+      </w:r>
+    </w:p>
+    <w:p>
+      <w:pPr>
+        <w:pStyle w:val="ListParagraph"/>
+        <w:numPr>
+          <w:ilvl w:val="0"/>
+          <w:numId w:val="2"/>
+        </w:numPr>
+        <w:spacing w:after="80"/>
+      </w:pPr>
+      <w:r>
+        <w:t xml:space="preserve">Settings → API: copiar Project URL, anon key y service_role key</w:t>
+      </w:r>
+    </w:p>
+    <w:p>
+      <w:pPr>
+        <w:pStyle w:val="ListParagraph"/>
+        <w:numPr>
+          <w:ilvl w:val="0"/>
+          <w:numId w:val="2"/>
+        </w:numPr>
+        <w:spacing w:after="80"/>
+      </w:pPr>
+      <w:r>
+        <w:t xml:space="preserve">Attack Protection: activar CAPTCHA + pegar el Secret Key de Turnstile</w:t>
+      </w:r>
+    </w:p>
+    <w:p>
+      <w:pPr>
+        <w:pStyle w:val="Heading2"/>
+        <w:spacing w:after="120" w:before="200"/>
+      </w:pPr>
+      <w:r>
+        <w:rPr>
+          <w:b/>
+          <w:bCs/>
+          <w:sz w:val="28"/>
+          <w:szCs w:val="28"/>
+        </w:rPr>
+        <w:t xml:space="preserve">Parte B — Vercel (lo hace el script)</w:t>
+      </w:r>
+    </w:p>
+    <w:p>
+      <w:pPr>
+        <w:pStyle w:val="ListParagraph"/>
+        <w:numPr>
+          <w:ilvl w:val="0"/>
+          <w:numId w:val="2"/>
+        </w:numPr>
+        <w:spacing w:after="80"/>
+      </w:pPr>
+      <w:r>
+        <w:t xml:space="preserve">Conseguir un token de Vercel en vercel.com/account/tokens y exportarlo: $env:VERCEL_TOKEN="..."</w:t>
+      </w:r>
+    </w:p>
+    <w:p>
+      <w:pPr>
+        <w:pStyle w:val="ListParagraph"/>
+        <w:numPr>
+          <w:ilvl w:val="0"/>
+          <w:numId w:val="2"/>
+        </w:numPr>
+        <w:spacing w:after="80"/>
+      </w:pPr>
+      <w:r>
+        <w:t xml:space="preserve">Copiar webapp/scripts/nueva-instancia.local.json.example a nueva-instancia.local.json y completarlo</w:t>
+      </w:r>
+    </w:p>
+    <w:p>
+      <w:pPr>
+        <w:pStyle w:val="ListParagraph"/>
+        <w:numPr>
+          <w:ilvl w:val="0"/>
+          <w:numId w:val="2"/>
+        </w:numPr>
+        <w:spacing w:after="80"/>
+      </w:pPr>
+      <w:r>
+        <w:t xml:space="preserve">node webapp/scripts/crear-instancia.mjs --dry-run (revisar el plan)</w:t>
+      </w:r>
+    </w:p>
+    <w:p>
+      <w:pPr>
+        <w:pStyle w:val="ListParagraph"/>
+        <w:numPr>
+          <w:ilvl w:val="0"/>
+          <w:numId w:val="2"/>
+        </w:numPr>
+        <w:spacing w:after="80"/>
+      </w:pPr>
+      <w:r>
+        <w:t xml:space="preserve">node webapp/scripts/crear-instancia.mjs (crea el proyecto + carga las 9 env vars + dispara el deploy)</w:t>
+      </w:r>
+    </w:p>
+    <w:p>
+      <w:pPr>
+        <w:pStyle w:val="Heading2"/>
+        <w:spacing w:after="120" w:before="200"/>
+      </w:pPr>
+      <w:r>
+        <w:rPr>
+          <w:b/>
+          <w:bCs/>
+          <w:sz w:val="28"/>
+          <w:szCs w:val="28"/>
+        </w:rPr>
+        <w:t xml:space="preserve">Parte C — Cierre (a mano, rápido)</w:t>
+      </w:r>
+    </w:p>
+    <w:p>
+      <w:pPr>
+        <w:pStyle w:val="ListParagraph"/>
+        <w:numPr>
+          <w:ilvl w:val="0"/>
+          <w:numId w:val="2"/>
+        </w:numPr>
+        <w:spacing w:after="80"/>
+      </w:pPr>
+      <w:r>
+        <w:t xml:space="preserve">Cloudflare Turnstile: agregar el hostname &lt;nombre&gt;.vercel.app al widget</w:t>
+      </w:r>
+    </w:p>
+    <w:p>
+      <w:pPr>
+        <w:pStyle w:val="ListParagraph"/>
+        <w:numPr>
+          <w:ilvl w:val="0"/>
+          <w:numId w:val="2"/>
+        </w:numPr>
+        <w:spacing w:after="80"/>
+      </w:pPr>
+      <w:r>
+        <w:t xml:space="preserve">Google: NADA (callback único ya configurado para todas las instancias)</w:t>
+      </w:r>
+    </w:p>
+    <w:p>
+      <w:pPr>
+        <w:pStyle w:val="ListParagraph"/>
+        <w:numPr>
+          <w:ilvl w:val="0"/>
+          <w:numId w:val="2"/>
+        </w:numPr>
+        <w:spacing w:after="80"/>
+      </w:pPr>
+      <w:r>
+        <w:t xml:space="preserve">Registrar la instancia en la Consola Palantiri</w:t>
+      </w:r>
+    </w:p>
+    <w:p>
+      <w:pPr>
+        <w:pStyle w:val="ListParagraph"/>
+        <w:numPr>
+          <w:ilvl w:val="0"/>
+          <w:numId w:val="2"/>
+        </w:numPr>
+        <w:spacing w:after="80"/>
+      </w:pPr>
+      <w:r>
+        <w:t xml:space="preserve">Verificar https://&lt;nombre&gt;.vercel.app/api/health → status: ok</w:t>
+      </w:r>
+    </w:p>
+    <w:p>
+      <w:pPr>
+        <w:spacing w:after="120"/>
+      </w:pPr>
+      <w:r>
+        <w:rPr>
+          <w:b/>
+          <w:bCs/>
+        </w:rPr>
+        <w:t xml:space="preserve">¿Qué es el token de Vercel?</w:t>
+      </w:r>
+    </w:p>
+    <w:p>
+      <w:pPr>
+        <w:spacing w:after="120"/>
+      </w:pPr>
+      <w:r>
+        <w:t xml:space="preserve">Una llave de acceso a tu cuenta de Vercel para programas (la API). El script la usa para crear el proyecto y cargar las variables en tu nombre, sin hacer clics. Es secreta (no se sube a git) y se regenera o borra cuando quieras, sin afectar tu contraseña.</w:t>
+      </w:r>
+    </w:p>
+    <w:p>
+      <w:pPr>
+        <w:spacing w:after="120"/>
+      </w:pPr>
+      <w:r>
+        <w:rPr>
+          <w:b/>
+          <w:bCs/>
+        </w:rPr>
+        <w:t xml:space="preserve">Google: callback único</w:t>
+      </w:r>
+    </w:p>
+    <w:p>
+      <w:pPr>
+        <w:spacing w:after="120"/>
+      </w:pPr>
+      <w:r>
+        <w:t xml:space="preserve">Desde junio 2026 ya no hay que registrar la URL de cada consultora en Google Cloud. Todas las instancias usan un callback central (el de la madre). El cliente solo toca 'Conectar con Google' dentro de su app. El cartel 'Google no verificó esta app' es normal: Configuración avanzada → Continuar.</w:t>
       </w:r>
     </w:p>
     <w:p>

</xml_diff>

<commit_message>
Manuales al dia: migraciones 0001-0008 + bundle, checklist de alta alineada al script
- MANUAL-SUPERUSUARIO.md (.md + .docx): lista de migraciones incluye 0008 y el
  MIGRACIONES-BUNDLE; checklist de alta reescrita (script, callback unico, CAPTCHA
  3 piezas, admin del cliente, .vercel.app por defecto)

Co-Authored-By: Claude Opus 4.8 <noreply@anthropic.com>
</commit_message>
<xml_diff>
--- a/MANUAL-SUPERUSUARIO.docx
+++ b/MANUAL-SUPERUSUARIO.docx
@@ -2830,33 +2830,33 @@
         <w:spacing w:after="80"/>
       </w:pPr>
       <w:r>
-        <w:t xml:space="preserve">Para cada archivo (en orden), copia el contenido:</w:t>
-      </w:r>
-    </w:p>
-    <w:p>
-      <w:pPr>
-        <w:pStyle w:val="ListParagraph"/>
-        <w:numPr>
-          <w:ilvl w:val="0"/>
-          <w:numId w:val="2"/>
-        </w:numPr>
-        <w:spacing w:after="80"/>
-      </w:pPr>
-      <w:r>
-        <w:t xml:space="preserve">0001_schema.sql → 0002_rls.sql → ... → 0007_instancias_consultoras.sql</w:t>
-      </w:r>
-    </w:p>
-    <w:p>
-      <w:pPr>
-        <w:pStyle w:val="ListParagraph"/>
-        <w:numPr>
-          <w:ilvl w:val="0"/>
-          <w:numId w:val="2"/>
-        </w:numPr>
-        <w:spacing w:after="80"/>
-      </w:pPr>
-      <w:r>
-        <w:t xml:space="preserve">Tocá RUN después de cada uno → ✔️ Verdes = OK</w:t>
+        <w:t xml:space="preserve">Lo más rápido: pegá TODO webapp/supabase/MIGRACIONES-BUNDLE.sql (trae las 8 migraciones de una) → RUN</w:t>
+      </w:r>
+    </w:p>
+    <w:p>
+      <w:pPr>
+        <w:pStyle w:val="ListParagraph"/>
+        <w:numPr>
+          <w:ilvl w:val="0"/>
+          <w:numId w:val="2"/>
+        </w:numPr>
+        <w:spacing w:after="80"/>
+      </w:pPr>
+      <w:r>
+        <w:t xml:space="preserve">O una por una en orden: 0001_schema.sql → ... → 0008_admin_gestiona_usuarios.sql</w:t>
+      </w:r>
+    </w:p>
+    <w:p>
+      <w:pPr>
+        <w:pStyle w:val="ListParagraph"/>
+        <w:numPr>
+          <w:ilvl w:val="0"/>
+          <w:numId w:val="2"/>
+        </w:numPr>
+        <w:spacing w:after="80"/>
+      </w:pPr>
+      <w:r>
+        <w:t xml:space="preserve">✔️ 'Success' = OK</w:t>
       </w:r>
     </w:p>
     <w:p>

</xml_diff>

<commit_message>
Alta: agregar paso de acceso de soporte (invitar palantiriautomat como Administrator a la org Supabase del cliente)
- Guia in-app (Consola): nuevo paso 2 'Darte acceso a la base'; renumerados 3-8
- ALTA-CONSULTORA.md: en checklist A/B/C y en el detalle de Supabase
- MANUAL-SUPERUSUARIO (.md + .docx): en la Parte A del alta automatizada
- Permite correr migraciones (como la 0009) sin loguearse como el cliente
</commit_message>
<xml_diff>
--- a/MANUAL-SUPERUSUARIO.docx
+++ b/MANUAL-SUPERUSUARIO.docx
@@ -3176,7 +3176,20 @@
         <w:spacing w:after="80"/>
       </w:pPr>
       <w:r>
-        <w:t xml:space="preserve">SQL Editor → correr webapp/supabase/MIGRACIONES-BUNDLE.sql (las 8 migraciones de una)</w:t>
+        <w:t xml:space="preserve">Acceso de soporte: el dueño invita a palantiriautomat@gmail.com como Administrator (Organization → Team → Invite member) para administrar la base y correr migraciones sin loguearse como el cliente</w:t>
+      </w:r>
+    </w:p>
+    <w:p>
+      <w:pPr>
+        <w:pStyle w:val="ListParagraph"/>
+        <w:numPr>
+          <w:ilvl w:val="0"/>
+          <w:numId w:val="2"/>
+        </w:numPr>
+        <w:spacing w:after="80"/>
+      </w:pPr>
+      <w:r>
+        <w:t xml:space="preserve">SQL Editor → correr webapp/supabase/MIGRACIONES-BUNDLE.sql (todas las migraciones de una)</w:t>
       </w:r>
     </w:p>
     <w:p>

</xml_diff>